<commit_message>
Update report.docx and report v2.docx to include v2.4 updates
</commit_message>
<xml_diff>
--- a/report/report v2.docx
+++ b/report/report v2.docx
@@ -6041,13 +6041,9 @@
       <w:tr>
         <w:tc>
           <w:tcPr>
-            <w:tcW w:w="550" w:type="dxa"/>
-            <w:shd w:val="clear" w:color="auto" w:fill="F2F2F2" w:themeFill="background1" w:themeFillShade="F2"/>
-          </w:tcPr>
-          <w:p>
-            <w:pPr>
-              <w:jc w:val="center"/>
-            </w:pPr>
+            <w:tcW w:type="dxa" w:w="550"/>
+          </w:tcPr>
+          <w:p>
             <w:r>
               <w:t>21</w:t>
             </w:r>
@@ -6055,12 +6051,9 @@
         </w:tc>
         <w:tc>
           <w:tcPr>
-            <w:tcW w:w="3127" w:type="dxa"/>
-          </w:tcPr>
-          <w:p>
-            <w:pPr>
-              <w:ind w:left="154"/>
-            </w:pPr>
+            <w:tcW w:type="dxa" w:w="3127"/>
+          </w:tcPr>
+          <w:p>
             <w:r>
               <w:t>Kick (deactivate) and restore members</w:t>
             </w:r>
@@ -6068,13 +6061,9 @@
         </w:tc>
         <w:tc>
           <w:tcPr>
-            <w:tcW w:w="1196" w:type="dxa"/>
-            <w:shd w:val="clear" w:color="auto" w:fill="FDE9D9" w:themeFill="accent6" w:themeFillTint="33"/>
-          </w:tcPr>
-          <w:p>
-            <w:pPr>
-              <w:jc w:val="center"/>
-            </w:pPr>
+            <w:tcW w:type="dxa" w:w="1196"/>
+          </w:tcPr>
+          <w:p>
             <w:r>
               <w:t>Advanced</w:t>
             </w:r>
@@ -6082,13 +6071,9 @@
         </w:tc>
         <w:tc>
           <w:tcPr>
-            <w:tcW w:w="1098" w:type="dxa"/>
-            <w:shd w:val="clear" w:color="auto" w:fill="EAF1DD" w:themeFill="accent3" w:themeFillTint="33"/>
-          </w:tcPr>
-          <w:p>
-            <w:pPr>
-              <w:jc w:val="center"/>
-            </w:pPr>
+            <w:tcW w:type="dxa" w:w="1098"/>
+          </w:tcPr>
+          <w:p>
             <w:r>
               <w:t>Done</w:t>
             </w:r>
@@ -6096,12 +6081,9 @@
         </w:tc>
         <w:tc>
           <w:tcPr>
-            <w:tcW w:w="3055" w:type="dxa"/>
-          </w:tcPr>
-          <w:p>
-            <w:pPr>
-              <w:ind w:left="225"/>
-            </w:pPr>
+            <w:tcW w:type="dxa" w:w="3055"/>
+          </w:tcPr>
+          <w:p>
             <w:r>
               <w:t>Marks member as deleted with isDeleted=1, isActive=0; preserves violations; full restore reinstates member to active status</w:t>
             </w:r>
@@ -6111,13 +6093,9 @@
       <w:tr>
         <w:tc>
           <w:tcPr>
-            <w:tcW w:w="550" w:type="dxa"/>
-            <w:shd w:val="clear" w:color="auto" w:fill="F2F2F2" w:themeFill="background1" w:themeFillShade="F2"/>
-          </w:tcPr>
-          <w:p>
-            <w:pPr>
-              <w:jc w:val="center"/>
-            </w:pPr>
+            <w:tcW w:type="dxa" w:w="550"/>
+          </w:tcPr>
+          <w:p>
             <w:r>
               <w:t>22</w:t>
             </w:r>
@@ -6125,12 +6103,9 @@
         </w:tc>
         <w:tc>
           <w:tcPr>
-            <w:tcW w:w="3127" w:type="dxa"/>
-          </w:tcPr>
-          <w:p>
-            <w:pPr>
-              <w:ind w:left="154"/>
-            </w:pPr>
+            <w:tcW w:type="dxa" w:w="3127"/>
+          </w:tcPr>
+          <w:p>
             <w:r>
               <w:t>Discipline Dashboard (Out CLB tracking)</w:t>
             </w:r>
@@ -6138,13 +6113,9 @@
         </w:tc>
         <w:tc>
           <w:tcPr>
-            <w:tcW w:w="1196" w:type="dxa"/>
-            <w:shd w:val="clear" w:color="auto" w:fill="FDE9D9" w:themeFill="accent6" w:themeFillTint="33"/>
-          </w:tcPr>
-          <w:p>
-            <w:pPr>
-              <w:jc w:val="center"/>
-            </w:pPr>
+            <w:tcW w:type="dxa" w:w="1196"/>
+          </w:tcPr>
+          <w:p>
             <w:r>
               <w:t>Advanced</w:t>
             </w:r>
@@ -6152,13 +6123,9 @@
         </w:tc>
         <w:tc>
           <w:tcPr>
-            <w:tcW w:w="1098" w:type="dxa"/>
-            <w:shd w:val="clear" w:color="auto" w:fill="EAF1DD" w:themeFill="accent3" w:themeFillTint="33"/>
-          </w:tcPr>
-          <w:p>
-            <w:pPr>
-              <w:jc w:val="center"/>
-            </w:pPr>
+            <w:tcW w:type="dxa" w:w="1098"/>
+          </w:tcPr>
+          <w:p>
             <w:r>
               <w:t>Done</w:t>
             </w:r>
@@ -6166,12 +6133,9 @@
         </w:tc>
         <w:tc>
           <w:tcPr>
-            <w:tcW w:w="3055" w:type="dxa"/>
-          </w:tcPr>
-          <w:p>
-            <w:pPr>
-              <w:ind w:left="225"/>
-            </w:pPr>
+            <w:tcW w:type="dxa" w:w="3055"/>
+          </w:tcPr>
+          <w:p>
             <w:r>
               <w:t>Shows kicked members, members near Out CLB threshold, and recent violations in a consolidated dashboard view</w:t>
             </w:r>
@@ -6181,13 +6145,9 @@
       <w:tr>
         <w:tc>
           <w:tcPr>
-            <w:tcW w:w="550" w:type="dxa"/>
-            <w:shd w:val="clear" w:color="auto" w:fill="F2F2F2" w:themeFill="background1" w:themeFillShade="F2"/>
-          </w:tcPr>
-          <w:p>
-            <w:pPr>
-              <w:jc w:val="center"/>
-            </w:pPr>
+            <w:tcW w:type="dxa" w:w="550"/>
+          </w:tcPr>
+          <w:p>
             <w:r>
               <w:t>23</w:t>
             </w:r>
@@ -6195,12 +6155,9 @@
         </w:tc>
         <w:tc>
           <w:tcPr>
-            <w:tcW w:w="3127" w:type="dxa"/>
-          </w:tcPr>
-          <w:p>
-            <w:pPr>
-              <w:ind w:left="154"/>
-            </w:pPr>
+            <w:tcW w:type="dxa" w:w="3127"/>
+          </w:tcPr>
+          <w:p>
             <w:r>
               <w:t>Password hashing with FNV-1a + XOR encryption</w:t>
             </w:r>
@@ -6208,13 +6165,9 @@
         </w:tc>
         <w:tc>
           <w:tcPr>
-            <w:tcW w:w="1196" w:type="dxa"/>
-            <w:shd w:val="clear" w:color="auto" w:fill="FDE9D9" w:themeFill="accent6" w:themeFillTint="33"/>
-          </w:tcPr>
-          <w:p>
-            <w:pPr>
-              <w:jc w:val="center"/>
-            </w:pPr>
+            <w:tcW w:type="dxa" w:w="1196"/>
+          </w:tcPr>
+          <w:p>
             <w:r>
               <w:t>Advanced</w:t>
             </w:r>
@@ -6222,13 +6175,9 @@
         </w:tc>
         <w:tc>
           <w:tcPr>
-            <w:tcW w:w="1098" w:type="dxa"/>
-            <w:shd w:val="clear" w:color="auto" w:fill="EAF1DD" w:themeFill="accent3" w:themeFillTint="33"/>
-          </w:tcPr>
-          <w:p>
-            <w:pPr>
-              <w:jc w:val="center"/>
-            </w:pPr>
+            <w:tcW w:type="dxa" w:w="1098"/>
+          </w:tcPr>
+          <w:p>
             <w:r>
               <w:t>Done</w:t>
             </w:r>
@@ -6236,12 +6185,9 @@
         </w:tc>
         <w:tc>
           <w:tcPr>
-            <w:tcW w:w="3055" w:type="dxa"/>
-          </w:tcPr>
-          <w:p>
-            <w:pPr>
-              <w:ind w:left="225"/>
-            </w:pPr>
+            <w:tcW w:type="dxa" w:w="3055"/>
+          </w:tcPr>
+          <w:p>
             <w:r>
               <w:t>Salted FNV-1a hash with 10 rounds; per-account random salt; XOR encryption of hash hex string; prevents plain-text recovery</w:t>
             </w:r>
@@ -6251,13 +6197,9 @@
       <w:tr>
         <w:tc>
           <w:tcPr>
-            <w:tcW w:w="550" w:type="dxa"/>
-            <w:shd w:val="clear" w:color="auto" w:fill="F2F2F2" w:themeFill="background1" w:themeFillShade="F2"/>
-          </w:tcPr>
-          <w:p>
-            <w:pPr>
-              <w:jc w:val="center"/>
-            </w:pPr>
+            <w:tcW w:type="dxa" w:w="550"/>
+          </w:tcPr>
+          <w:p>
             <w:r>
               <w:t>24</w:t>
             </w:r>
@@ -6265,12 +6207,9 @@
         </w:tc>
         <w:tc>
           <w:tcPr>
-            <w:tcW w:w="3127" w:type="dxa"/>
-          </w:tcPr>
-          <w:p>
-            <w:pPr>
-              <w:ind w:left="154"/>
-            </w:pPr>
+            <w:tcW w:type="dxa" w:w="3127"/>
+          </w:tcPr>
+          <w:p>
             <w:r>
               <w:t>Input validation enhancements</w:t>
             </w:r>
@@ -6278,13 +6217,9 @@
         </w:tc>
         <w:tc>
           <w:tcPr>
-            <w:tcW w:w="1196" w:type="dxa"/>
-            <w:shd w:val="clear" w:color="auto" w:fill="DBE5F1" w:themeFill="accent1" w:themeFillTint="33"/>
-          </w:tcPr>
-          <w:p>
-            <w:pPr>
-              <w:jc w:val="center"/>
-            </w:pPr>
+            <w:tcW w:type="dxa" w:w="1196"/>
+          </w:tcPr>
+          <w:p>
             <w:r>
               <w:t>Required</w:t>
             </w:r>
@@ -6292,13 +6227,9 @@
         </w:tc>
         <w:tc>
           <w:tcPr>
-            <w:tcW w:w="1098" w:type="dxa"/>
-            <w:shd w:val="clear" w:color="auto" w:fill="EAF1DD" w:themeFill="accent3" w:themeFillTint="33"/>
-          </w:tcPr>
-          <w:p>
-            <w:pPr>
-              <w:jc w:val="center"/>
-            </w:pPr>
+            <w:tcW w:type="dxa" w:w="1098"/>
+          </w:tcPr>
+          <w:p>
             <w:r>
               <w:t>Done</w:t>
             </w:r>
@@ -6306,12 +6237,9 @@
         </w:tc>
         <w:tc>
           <w:tcPr>
-            <w:tcW w:w="3055" w:type="dxa"/>
-          </w:tcPr>
-          <w:p>
-            <w:pPr>
-              <w:ind w:left="225"/>
-            </w:pPr>
+            <w:tcW w:type="dxa" w:w="3055"/>
+          </w:tcPr>
+          <w:p>
             <w:r>
               <w:t>Email: rejects commas, invalid TLD chars, dots at start/end, consecutive dots; enforces min 2-letter TLD. Phone: unique validation. All edit fields re-prompt on failure</w:t>
             </w:r>
@@ -6321,13 +6249,9 @@
       <w:tr>
         <w:tc>
           <w:tcPr>
-            <w:tcW w:w="550" w:type="dxa"/>
-            <w:shd w:val="clear" w:color="auto" w:fill="F2F2F2" w:themeFill="background1" w:themeFillShade="F2"/>
-          </w:tcPr>
-          <w:p>
-            <w:pPr>
-              <w:jc w:val="center"/>
-            </w:pPr>
+            <w:tcW w:type="dxa" w:w="550"/>
+          </w:tcPr>
+          <w:p>
             <w:r>
               <w:t>25</w:t>
             </w:r>
@@ -6335,12 +6259,9 @@
         </w:tc>
         <w:tc>
           <w:tcPr>
-            <w:tcW w:w="3127" w:type="dxa"/>
-          </w:tcPr>
-          <w:p>
-            <w:pPr>
-              <w:ind w:left="154"/>
-            </w:pPr>
+            <w:tcW w:type="dxa" w:w="3127"/>
+          </w:tcPr>
+          <w:p>
             <w:r>
               <w:t>"0 de quay lai" (zero to go back) on MSSV prompts</w:t>
             </w:r>
@@ -6348,13 +6269,9 @@
         </w:tc>
         <w:tc>
           <w:tcPr>
-            <w:tcW w:w="1196" w:type="dxa"/>
-            <w:shd w:val="clear" w:color="auto" w:fill="DBE5F1" w:themeFill="accent1" w:themeFillTint="33"/>
-          </w:tcPr>
-          <w:p>
-            <w:pPr>
-              <w:jc w:val="center"/>
-            </w:pPr>
+            <w:tcW w:type="dxa" w:w="1196"/>
+          </w:tcPr>
+          <w:p>
             <w:r>
               <w:t>Required</w:t>
             </w:r>
@@ -6362,13 +6279,9 @@
         </w:tc>
         <w:tc>
           <w:tcPr>
-            <w:tcW w:w="1098" w:type="dxa"/>
-            <w:shd w:val="clear" w:color="auto" w:fill="EAF1DD" w:themeFill="accent3" w:themeFillTint="33"/>
-          </w:tcPr>
-          <w:p>
-            <w:pPr>
-              <w:jc w:val="center"/>
-            </w:pPr>
+            <w:tcW w:type="dxa" w:w="1098"/>
+          </w:tcPr>
+          <w:p>
             <w:r>
               <w:t>Done</w:t>
             </w:r>
@@ -6376,12 +6289,9 @@
         </w:tc>
         <w:tc>
           <w:tcPr>
-            <w:tcW w:w="3055" w:type="dxa"/>
-          </w:tcPr>
-          <w:p>
-            <w:pPr>
-              <w:ind w:left="225"/>
-            </w:pPr>
+            <w:tcW w:type="dxa" w:w="3055"/>
+          </w:tcPr>
+          <w:p>
             <w:r>
               <w:t>All student ID prompts support entering 0 to cancel and return to previous menu; implemented in member/violation operations</w:t>
             </w:r>
@@ -6391,13 +6301,9 @@
       <w:tr>
         <w:tc>
           <w:tcPr>
-            <w:tcW w:w="550" w:type="dxa"/>
-            <w:shd w:val="clear" w:color="auto" w:fill="F2F2F2" w:themeFill="background1" w:themeFillShade="F2"/>
-          </w:tcPr>
-          <w:p>
-            <w:pPr>
-              <w:jc w:val="center"/>
-            </w:pPr>
+            <w:tcW w:type="dxa" w:w="550"/>
+          </w:tcPr>
+          <w:p>
             <w:r>
               <w:t>26</w:t>
             </w:r>
@@ -6405,12 +6311,9 @@
         </w:tc>
         <w:tc>
           <w:tcPr>
-            <w:tcW w:w="3127" w:type="dxa"/>
-          </w:tcPr>
-          <w:p>
-            <w:pPr>
-              <w:ind w:left="154"/>
-            </w:pPr>
+            <w:tcW w:type="dxa" w:w="3127"/>
+          </w:tcPr>
+          <w:p>
             <w:r>
               <w:t>Pagination across list views</w:t>
             </w:r>
@@ -6418,13 +6321,9 @@
         </w:tc>
         <w:tc>
           <w:tcPr>
-            <w:tcW w:w="1196" w:type="dxa"/>
-            <w:shd w:val="clear" w:color="auto" w:fill="FDE9D9" w:themeFill="accent6" w:themeFillTint="33"/>
-          </w:tcPr>
-          <w:p>
-            <w:pPr>
-              <w:jc w:val="center"/>
-            </w:pPr>
+            <w:tcW w:type="dxa" w:w="1196"/>
+          </w:tcPr>
+          <w:p>
             <w:r>
               <w:t>Advanced</w:t>
             </w:r>
@@ -6432,13 +6331,9 @@
         </w:tc>
         <w:tc>
           <w:tcPr>
-            <w:tcW w:w="1098" w:type="dxa"/>
-            <w:shd w:val="clear" w:color="auto" w:fill="EAF1DD" w:themeFill="accent3" w:themeFillTint="33"/>
-          </w:tcPr>
-          <w:p>
-            <w:pPr>
-              <w:jc w:val="center"/>
-            </w:pPr>
+            <w:tcW w:type="dxa" w:w="1098"/>
+          </w:tcPr>
+          <w:p>
             <w:r>
               <w:t>Done</w:t>
             </w:r>
@@ -6446,14 +6341,219 @@
         </w:tc>
         <w:tc>
           <w:tcPr>
-            <w:tcW w:w="3055" w:type="dxa"/>
-          </w:tcPr>
-          <w:p>
-            <w:pPr>
-              <w:ind w:left="225"/>
-            </w:pPr>
+            <w:tcW w:type="dxa" w:w="3055"/>
+          </w:tcPr>
+          <w:p>
             <w:r>
               <w:t>Member list, violation view (all/filtered), and date search use consistent clear-screen paging: 15 rows/page, n/m/q navigation</w:t>
+            </w:r>
+          </w:p>
+        </w:tc>
+      </w:tr>
+      <w:tr>
+        <w:tc>
+          <w:tcPr>
+            <w:tcW w:type="dxa" w:w="550"/>
+          </w:tcPr>
+          <w:p>
+            <w:r>
+              <w:t>27</w:t>
+            </w:r>
+          </w:p>
+        </w:tc>
+        <w:tc>
+          <w:tcPr>
+            <w:tcW w:type="dxa" w:w="3127"/>
+          </w:tcPr>
+          <w:p>
+            <w:r>
+              <w:t>CSV Import for violations with auto-reset absences</w:t>
+            </w:r>
+          </w:p>
+        </w:tc>
+        <w:tc>
+          <w:tcPr>
+            <w:tcW w:type="dxa" w:w="1196"/>
+          </w:tcPr>
+          <w:p>
+            <w:r>
+              <w:t>Advanced</w:t>
+            </w:r>
+          </w:p>
+        </w:tc>
+        <w:tc>
+          <w:tcPr>
+            <w:tcW w:type="dxa" w:w="1098"/>
+          </w:tcPr>
+          <w:p>
+            <w:r>
+              <w:t>Done</w:t>
+            </w:r>
+          </w:p>
+        </w:tc>
+        <w:tc>
+          <w:tcPr>
+            <w:tcW w:type="dxa" w:w="3055"/>
+          </w:tcPr>
+          <w:p>
+            <w:r>
+              <w:t>Import 3-column CSV violations; dry-run validates entries and filters errors; automatically resets absences to 0 for members not absent in CSV batch</w:t>
+            </w:r>
+          </w:p>
+        </w:tc>
+      </w:tr>
+      <w:tr>
+        <w:tc>
+          <w:tcPr>
+            <w:tcW w:type="dxa" w:w="550"/>
+          </w:tcPr>
+          <w:p>
+            <w:r>
+              <w:t>28</w:t>
+            </w:r>
+          </w:p>
+        </w:tc>
+        <w:tc>
+          <w:tcPr>
+            <w:tcW w:type="dxa" w:w="3127"/>
+          </w:tcPr>
+          <w:p>
+            <w:r>
+              <w:t>Self-view Out CLB threshold and violations</w:t>
+            </w:r>
+          </w:p>
+        </w:tc>
+        <w:tc>
+          <w:tcPr>
+            <w:tcW w:type="dxa" w:w="1196"/>
+          </w:tcPr>
+          <w:p>
+            <w:r>
+              <w:t>Required</w:t>
+            </w:r>
+          </w:p>
+        </w:tc>
+        <w:tc>
+          <w:tcPr>
+            <w:tcW w:type="dxa" w:w="1098"/>
+          </w:tcPr>
+          <w:p>
+            <w:r>
+              <w:t>Done</w:t>
+            </w:r>
+          </w:p>
+        </w:tc>
+        <w:tc>
+          <w:tcPr>
+            <w:tcW w:type="dxa" w:w="3055"/>
+          </w:tcPr>
+          <w:p>
+            <w:r>
+              <w:t>Members can view own active status, consecutive absences, unpaid fines count, and read the club's Out CLB threshold rules directly from their menu</w:t>
+            </w:r>
+          </w:p>
+        </w:tc>
+      </w:tr>
+      <w:tr>
+        <w:tc>
+          <w:tcPr>
+            <w:tcW w:type="dxa" w:w="550"/>
+          </w:tcPr>
+          <w:p>
+            <w:r>
+              <w:t>29</w:t>
+            </w:r>
+          </w:p>
+        </w:tc>
+        <w:tc>
+          <w:tcPr>
+            <w:tcW w:type="dxa" w:w="3127"/>
+          </w:tcPr>
+          <w:p>
+            <w:r>
+              <w:t>Obfuscated and secure local system logging</w:t>
+            </w:r>
+          </w:p>
+        </w:tc>
+        <w:tc>
+          <w:tcPr>
+            <w:tcW w:type="dxa" w:w="1196"/>
+          </w:tcPr>
+          <w:p>
+            <w:r>
+              <w:t>Advanced</w:t>
+            </w:r>
+          </w:p>
+        </w:tc>
+        <w:tc>
+          <w:tcPr>
+            <w:tcW w:type="dxa" w:w="1098"/>
+          </w:tcPr>
+          <w:p>
+            <w:r>
+              <w:t>Done</w:t>
+            </w:r>
+          </w:p>
+        </w:tc>
+        <w:tc>
+          <w:tcPr>
+            <w:tcW w:type="dxa" w:w="3055"/>
+          </w:tcPr>
+          <w:p>
+            <w:r>
+              <w:t>Saves audit logs to system_audit.log with XOR 0x5A encryption, keeping newline characters to preserve structure; decrypts on-the-fly for admin viewing</w:t>
+            </w:r>
+          </w:p>
+        </w:tc>
+      </w:tr>
+      <w:tr>
+        <w:tc>
+          <w:tcPr>
+            <w:tcW w:type="dxa" w:w="550"/>
+          </w:tcPr>
+          <w:p>
+            <w:r>
+              <w:t>30</w:t>
+            </w:r>
+          </w:p>
+        </w:tc>
+        <w:tc>
+          <w:tcPr>
+            <w:tcW w:type="dxa" w:w="3127"/>
+          </w:tcPr>
+          <w:p>
+            <w:r>
+              <w:t>PIN-protected single-file backup export/import</w:t>
+            </w:r>
+          </w:p>
+        </w:tc>
+        <w:tc>
+          <w:tcPr>
+            <w:tcW w:type="dxa" w:w="1196"/>
+          </w:tcPr>
+          <w:p>
+            <w:r>
+              <w:t>Advanced</w:t>
+            </w:r>
+          </w:p>
+        </w:tc>
+        <w:tc>
+          <w:tcPr>
+            <w:tcW w:type="dxa" w:w="1098"/>
+          </w:tcPr>
+          <w:p>
+            <w:r>
+              <w:t>Done</w:t>
+            </w:r>
+          </w:p>
+        </w:tc>
+        <w:tc>
+          <w:tcPr>
+            <w:tcW w:type="dxa" w:w="3055"/>
+          </w:tcPr>
+          <w:p>
+            <w:r>
+              <w:t>Compiles members, accounts, violations, and encrypted audit logs into a single PIN-encrypted archive file; allows secure data migration between machines</w:t>
             </w:r>
           </w:p>
         </w:tc>
@@ -7633,35 +7733,19 @@
       <w:tr>
         <w:tc>
           <w:tcPr>
-            <w:tcW w:w="2400" w:type="dxa"/>
-            <w:shd w:val="clear" w:color="auto" w:fill="DBE5F1" w:themeFill="accent1" w:themeFillTint="33"/>
-          </w:tcPr>
-          <w:p>
-            <w:pPr>
-              <w:ind w:left="166"/>
-              <w:rPr>
-                <w:b/>
-                <w:bCs/>
-              </w:rPr>
-            </w:pPr>
-            <w:r>
-              <w:rPr>
-                <w:b/>
-                <w:bCs/>
-              </w:rPr>
-              <w:lastRenderedPageBreak/>
+            <w:tcW w:type="dxa" w:w="2400"/>
+          </w:tcPr>
+          <w:p>
+            <w:r>
               <w:t>run.bat</w:t>
             </w:r>
           </w:p>
         </w:tc>
         <w:tc>
           <w:tcPr>
-            <w:tcW w:w="6626" w:type="dxa"/>
-          </w:tcPr>
-          <w:p>
-            <w:pPr>
-              <w:ind w:left="105"/>
-            </w:pPr>
+            <w:tcW w:type="dxa" w:w="6626"/>
+          </w:tcPr>
+          <w:p>
             <w:r>
               <w:t>One-click build-and-run script. Calls mingw32-make, compiles seed_data.exe, runs seed, then launches the application.</w:t>
             </w:r>
@@ -7671,34 +7755,19 @@
       <w:tr>
         <w:tc>
           <w:tcPr>
-            <w:tcW w:w="2400" w:type="dxa"/>
-            <w:shd w:val="clear" w:color="auto" w:fill="DBE5F1" w:themeFill="accent1" w:themeFillTint="33"/>
-          </w:tcPr>
-          <w:p>
-            <w:pPr>
-              <w:ind w:left="166"/>
-              <w:rPr>
-                <w:b/>
-                <w:bCs/>
-              </w:rPr>
-            </w:pPr>
-            <w:r>
-              <w:rPr>
-                <w:b/>
-                <w:bCs/>
-              </w:rPr>
+            <w:tcW w:type="dxa" w:w="2400"/>
+          </w:tcPr>
+          <w:p>
+            <w:r>
               <w:t>report/</w:t>
             </w:r>
           </w:p>
         </w:tc>
         <w:tc>
           <w:tcPr>
-            <w:tcW w:w="6626" w:type="dxa"/>
-          </w:tcPr>
-          <w:p>
-            <w:pPr>
-              <w:ind w:left="105"/>
-            </w:pPr>
+            <w:tcW w:type="dxa" w:w="6626"/>
+          </w:tcPr>
+          <w:p>
             <w:r>
               <w:t>Defense report template (report.docx) and update script.</w:t>
             </w:r>
@@ -12568,13 +12637,9 @@
       <w:tr>
         <w:tc>
           <w:tcPr>
-            <w:tcW w:w="637" w:type="dxa"/>
-            <w:shd w:val="clear" w:color="auto" w:fill="F2F2F2" w:themeFill="background1" w:themeFillShade="F2"/>
-          </w:tcPr>
-          <w:p>
-            <w:pPr>
-              <w:jc w:val="center"/>
-            </w:pPr>
+            <w:tcW w:type="dxa" w:w="637"/>
+          </w:tcPr>
+          <w:p>
             <w:r>
               <w:t>1</w:t>
             </w:r>
@@ -12582,7 +12647,7 @@
         </w:tc>
         <w:tc>
           <w:tcPr>
-            <w:tcW w:w="2173" w:type="dxa"/>
+            <w:tcW w:type="dxa" w:w="2173"/>
           </w:tcPr>
           <w:p>
             <w:r>
@@ -12592,7 +12657,7 @@
         </w:tc>
         <w:tc>
           <w:tcPr>
-            <w:tcW w:w="6216" w:type="dxa"/>
+            <w:tcW w:type="dxa" w:w="6216"/>
           </w:tcPr>
           <w:p>
             <w:r>
@@ -12604,13 +12669,9 @@
       <w:tr>
         <w:tc>
           <w:tcPr>
-            <w:tcW w:w="637" w:type="dxa"/>
-            <w:shd w:val="clear" w:color="auto" w:fill="F2F2F2" w:themeFill="background1" w:themeFillShade="F2"/>
-          </w:tcPr>
-          <w:p>
-            <w:pPr>
-              <w:jc w:val="center"/>
-            </w:pPr>
+            <w:tcW w:type="dxa" w:w="637"/>
+          </w:tcPr>
+          <w:p>
             <w:r>
               <w:t>2</w:t>
             </w:r>
@@ -12618,7 +12679,7 @@
         </w:tc>
         <w:tc>
           <w:tcPr>
-            <w:tcW w:w="2173" w:type="dxa"/>
+            <w:tcW w:type="dxa" w:w="2173"/>
           </w:tcPr>
           <w:p>
             <w:r>
@@ -12628,7 +12689,7 @@
         </w:tc>
         <w:tc>
           <w:tcPr>
-            <w:tcW w:w="6216" w:type="dxa"/>
+            <w:tcW w:type="dxa" w:w="6216"/>
           </w:tcPr>
           <w:p>
             <w:r>
@@ -12640,13 +12701,9 @@
       <w:tr>
         <w:tc>
           <w:tcPr>
-            <w:tcW w:w="637" w:type="dxa"/>
-            <w:shd w:val="clear" w:color="auto" w:fill="F2F2F2" w:themeFill="background1" w:themeFillShade="F2"/>
-          </w:tcPr>
-          <w:p>
-            <w:pPr>
-              <w:jc w:val="center"/>
-            </w:pPr>
+            <w:tcW w:type="dxa" w:w="637"/>
+          </w:tcPr>
+          <w:p>
             <w:r>
               <w:t>3</w:t>
             </w:r>
@@ -12654,7 +12711,7 @@
         </w:tc>
         <w:tc>
           <w:tcPr>
-            <w:tcW w:w="2173" w:type="dxa"/>
+            <w:tcW w:type="dxa" w:w="2173"/>
           </w:tcPr>
           <w:p>
             <w:r>
@@ -12664,7 +12721,7 @@
         </w:tc>
         <w:tc>
           <w:tcPr>
-            <w:tcW w:w="6216" w:type="dxa"/>
+            <w:tcW w:type="dxa" w:w="6216"/>
           </w:tcPr>
           <w:p>
             <w:r>
@@ -12676,13 +12733,9 @@
       <w:tr>
         <w:tc>
           <w:tcPr>
-            <w:tcW w:w="637" w:type="dxa"/>
-            <w:shd w:val="clear" w:color="auto" w:fill="F2F2F2" w:themeFill="background1" w:themeFillShade="F2"/>
-          </w:tcPr>
-          <w:p>
-            <w:pPr>
-              <w:jc w:val="center"/>
-            </w:pPr>
+            <w:tcW w:type="dxa" w:w="637"/>
+          </w:tcPr>
+          <w:p>
             <w:r>
               <w:t>4</w:t>
             </w:r>
@@ -12690,7 +12743,7 @@
         </w:tc>
         <w:tc>
           <w:tcPr>
-            <w:tcW w:w="2173" w:type="dxa"/>
+            <w:tcW w:type="dxa" w:w="2173"/>
           </w:tcPr>
           <w:p>
             <w:r>
@@ -12700,7 +12753,7 @@
         </w:tc>
         <w:tc>
           <w:tcPr>
-            <w:tcW w:w="6216" w:type="dxa"/>
+            <w:tcW w:type="dxa" w:w="6216"/>
           </w:tcPr>
           <w:p>
             <w:r>
@@ -12712,13 +12765,9 @@
       <w:tr>
         <w:tc>
           <w:tcPr>
-            <w:tcW w:w="637" w:type="dxa"/>
-            <w:shd w:val="clear" w:color="auto" w:fill="F2F2F2" w:themeFill="background1" w:themeFillShade="F2"/>
-          </w:tcPr>
-          <w:p>
-            <w:pPr>
-              <w:jc w:val="center"/>
-            </w:pPr>
+            <w:tcW w:type="dxa" w:w="637"/>
+          </w:tcPr>
+          <w:p>
             <w:r>
               <w:t>5</w:t>
             </w:r>
@@ -12726,7 +12775,7 @@
         </w:tc>
         <w:tc>
           <w:tcPr>
-            <w:tcW w:w="2173" w:type="dxa"/>
+            <w:tcW w:type="dxa" w:w="2173"/>
           </w:tcPr>
           <w:p>
             <w:r>
@@ -12736,7 +12785,7 @@
         </w:tc>
         <w:tc>
           <w:tcPr>
-            <w:tcW w:w="6216" w:type="dxa"/>
+            <w:tcW w:type="dxa" w:w="6216"/>
           </w:tcPr>
           <w:p>
             <w:r>
@@ -12748,13 +12797,9 @@
       <w:tr>
         <w:tc>
           <w:tcPr>
-            <w:tcW w:w="637" w:type="dxa"/>
-            <w:shd w:val="clear" w:color="auto" w:fill="F2F2F2" w:themeFill="background1" w:themeFillShade="F2"/>
-          </w:tcPr>
-          <w:p>
-            <w:pPr>
-              <w:jc w:val="center"/>
-            </w:pPr>
+            <w:tcW w:type="dxa" w:w="637"/>
+          </w:tcPr>
+          <w:p>
             <w:r>
               <w:t>6</w:t>
             </w:r>
@@ -12762,7 +12807,7 @@
         </w:tc>
         <w:tc>
           <w:tcPr>
-            <w:tcW w:w="2173" w:type="dxa"/>
+            <w:tcW w:type="dxa" w:w="2173"/>
           </w:tcPr>
           <w:p>
             <w:r>
@@ -12772,7 +12817,7 @@
         </w:tc>
         <w:tc>
           <w:tcPr>
-            <w:tcW w:w="6216" w:type="dxa"/>
+            <w:tcW w:type="dxa" w:w="6216"/>
           </w:tcPr>
           <w:p>
             <w:r>
@@ -12784,13 +12829,9 @@
       <w:tr>
         <w:tc>
           <w:tcPr>
-            <w:tcW w:w="637" w:type="dxa"/>
-            <w:shd w:val="clear" w:color="auto" w:fill="F2F2F2" w:themeFill="background1" w:themeFillShade="F2"/>
-          </w:tcPr>
-          <w:p>
-            <w:pPr>
-              <w:jc w:val="center"/>
-            </w:pPr>
+            <w:tcW w:type="dxa" w:w="637"/>
+          </w:tcPr>
+          <w:p>
             <w:r>
               <w:t>7</w:t>
             </w:r>
@@ -12798,7 +12839,7 @@
         </w:tc>
         <w:tc>
           <w:tcPr>
-            <w:tcW w:w="2173" w:type="dxa"/>
+            <w:tcW w:type="dxa" w:w="2173"/>
           </w:tcPr>
           <w:p>
             <w:r>
@@ -12808,7 +12849,7 @@
         </w:tc>
         <w:tc>
           <w:tcPr>
-            <w:tcW w:w="6216" w:type="dxa"/>
+            <w:tcW w:type="dxa" w:w="6216"/>
           </w:tcPr>
           <w:p>
             <w:r>
@@ -12820,13 +12861,9 @@
       <w:tr>
         <w:tc>
           <w:tcPr>
-            <w:tcW w:w="637" w:type="dxa"/>
-            <w:shd w:val="clear" w:color="auto" w:fill="F2F2F2" w:themeFill="background1" w:themeFillShade="F2"/>
-          </w:tcPr>
-          <w:p>
-            <w:pPr>
-              <w:jc w:val="center"/>
-            </w:pPr>
+            <w:tcW w:type="dxa" w:w="637"/>
+          </w:tcPr>
+          <w:p>
             <w:r>
               <w:t>8</w:t>
             </w:r>
@@ -12834,7 +12871,7 @@
         </w:tc>
         <w:tc>
           <w:tcPr>
-            <w:tcW w:w="2173" w:type="dxa"/>
+            <w:tcW w:type="dxa" w:w="2173"/>
           </w:tcPr>
           <w:p>
             <w:r>
@@ -12844,7 +12881,7 @@
         </w:tc>
         <w:tc>
           <w:tcPr>
-            <w:tcW w:w="6216" w:type="dxa"/>
+            <w:tcW w:type="dxa" w:w="6216"/>
           </w:tcPr>
           <w:p>
             <w:r>
@@ -12856,13 +12893,9 @@
       <w:tr>
         <w:tc>
           <w:tcPr>
-            <w:tcW w:w="637" w:type="dxa"/>
-            <w:shd w:val="clear" w:color="auto" w:fill="F2F2F2" w:themeFill="background1" w:themeFillShade="F2"/>
-          </w:tcPr>
-          <w:p>
-            <w:pPr>
-              <w:jc w:val="center"/>
-            </w:pPr>
+            <w:tcW w:type="dxa" w:w="637"/>
+          </w:tcPr>
+          <w:p>
             <w:r>
               <w:t>9</w:t>
             </w:r>
@@ -12870,7 +12903,7 @@
         </w:tc>
         <w:tc>
           <w:tcPr>
-            <w:tcW w:w="2173" w:type="dxa"/>
+            <w:tcW w:type="dxa" w:w="2173"/>
           </w:tcPr>
           <w:p>
             <w:r>
@@ -12880,7 +12913,7 @@
         </w:tc>
         <w:tc>
           <w:tcPr>
-            <w:tcW w:w="6216" w:type="dxa"/>
+            <w:tcW w:type="dxa" w:w="6216"/>
           </w:tcPr>
           <w:p>
             <w:r>
@@ -12892,13 +12925,9 @@
       <w:tr>
         <w:tc>
           <w:tcPr>
-            <w:tcW w:w="637" w:type="dxa"/>
-            <w:shd w:val="clear" w:color="auto" w:fill="F2F2F2" w:themeFill="background1" w:themeFillShade="F2"/>
-          </w:tcPr>
-          <w:p>
-            <w:pPr>
-              <w:jc w:val="center"/>
-            </w:pPr>
+            <w:tcW w:type="dxa" w:w="637"/>
+          </w:tcPr>
+          <w:p>
             <w:r>
               <w:t>10</w:t>
             </w:r>
@@ -12906,7 +12935,7 @@
         </w:tc>
         <w:tc>
           <w:tcPr>
-            <w:tcW w:w="2173" w:type="dxa"/>
+            <w:tcW w:type="dxa" w:w="2173"/>
           </w:tcPr>
           <w:p>
             <w:r>
@@ -12916,7 +12945,7 @@
         </w:tc>
         <w:tc>
           <w:tcPr>
-            <w:tcW w:w="6216" w:type="dxa"/>
+            <w:tcW w:type="dxa" w:w="6216"/>
           </w:tcPr>
           <w:p>
             <w:r>
@@ -12928,13 +12957,9 @@
       <w:tr>
         <w:tc>
           <w:tcPr>
-            <w:tcW w:w="637" w:type="dxa"/>
-            <w:shd w:val="clear" w:color="auto" w:fill="F2F2F2" w:themeFill="background1" w:themeFillShade="F2"/>
-          </w:tcPr>
-          <w:p>
-            <w:pPr>
-              <w:jc w:val="center"/>
-            </w:pPr>
+            <w:tcW w:type="dxa" w:w="637"/>
+          </w:tcPr>
+          <w:p>
             <w:r>
               <w:t>11</w:t>
             </w:r>
@@ -12942,7 +12967,7 @@
         </w:tc>
         <w:tc>
           <w:tcPr>
-            <w:tcW w:w="2173" w:type="dxa"/>
+            <w:tcW w:type="dxa" w:w="2173"/>
           </w:tcPr>
           <w:p>
             <w:r>
@@ -12952,7 +12977,7 @@
         </w:tc>
         <w:tc>
           <w:tcPr>
-            <w:tcW w:w="6216" w:type="dxa"/>
+            <w:tcW w:type="dxa" w:w="6216"/>
           </w:tcPr>
           <w:p>
             <w:r>
@@ -12964,13 +12989,9 @@
       <w:tr>
         <w:tc>
           <w:tcPr>
-            <w:tcW w:w="637" w:type="dxa"/>
-            <w:shd w:val="clear" w:color="auto" w:fill="F2F2F2" w:themeFill="background1" w:themeFillShade="F2"/>
-          </w:tcPr>
-          <w:p>
-            <w:pPr>
-              <w:jc w:val="center"/>
-            </w:pPr>
+            <w:tcW w:type="dxa" w:w="637"/>
+          </w:tcPr>
+          <w:p>
             <w:r>
               <w:t>12</w:t>
             </w:r>
@@ -12978,7 +12999,7 @@
         </w:tc>
         <w:tc>
           <w:tcPr>
-            <w:tcW w:w="2173" w:type="dxa"/>
+            <w:tcW w:type="dxa" w:w="2173"/>
           </w:tcPr>
           <w:p>
             <w:r>
@@ -12988,7 +13009,7 @@
         </w:tc>
         <w:tc>
           <w:tcPr>
-            <w:tcW w:w="6216" w:type="dxa"/>
+            <w:tcW w:type="dxa" w:w="6216"/>
           </w:tcPr>
           <w:p>
             <w:r>
@@ -13000,13 +13021,9 @@
       <w:tr>
         <w:tc>
           <w:tcPr>
-            <w:tcW w:w="637" w:type="dxa"/>
-            <w:shd w:val="clear" w:color="auto" w:fill="F2F2F2" w:themeFill="background1" w:themeFillShade="F2"/>
-          </w:tcPr>
-          <w:p>
-            <w:pPr>
-              <w:jc w:val="center"/>
-            </w:pPr>
+            <w:tcW w:type="dxa" w:w="637"/>
+          </w:tcPr>
+          <w:p>
             <w:r>
               <w:t>13</w:t>
             </w:r>
@@ -13014,7 +13031,7 @@
         </w:tc>
         <w:tc>
           <w:tcPr>
-            <w:tcW w:w="2173" w:type="dxa"/>
+            <w:tcW w:type="dxa" w:w="2173"/>
           </w:tcPr>
           <w:p>
             <w:r>
@@ -13024,7 +13041,7 @@
         </w:tc>
         <w:tc>
           <w:tcPr>
-            <w:tcW w:w="6216" w:type="dxa"/>
+            <w:tcW w:type="dxa" w:w="6216"/>
           </w:tcPr>
           <w:p>
             <w:r>
@@ -13036,13 +13053,9 @@
       <w:tr>
         <w:tc>
           <w:tcPr>
-            <w:tcW w:w="637" w:type="dxa"/>
-            <w:shd w:val="clear" w:color="auto" w:fill="F2F2F2" w:themeFill="background1" w:themeFillShade="F2"/>
-          </w:tcPr>
-          <w:p>
-            <w:pPr>
-              <w:jc w:val="center"/>
-            </w:pPr>
+            <w:tcW w:type="dxa" w:w="637"/>
+          </w:tcPr>
+          <w:p>
             <w:r>
               <w:t>14</w:t>
             </w:r>
@@ -13050,7 +13063,7 @@
         </w:tc>
         <w:tc>
           <w:tcPr>
-            <w:tcW w:w="2173" w:type="dxa"/>
+            <w:tcW w:type="dxa" w:w="2173"/>
           </w:tcPr>
           <w:p>
             <w:r>
@@ -13060,7 +13073,7 @@
         </w:tc>
         <w:tc>
           <w:tcPr>
-            <w:tcW w:w="6216" w:type="dxa"/>
+            <w:tcW w:type="dxa" w:w="6216"/>
           </w:tcPr>
           <w:p>
             <w:r>
@@ -13072,13 +13085,9 @@
       <w:tr>
         <w:tc>
           <w:tcPr>
-            <w:tcW w:w="637" w:type="dxa"/>
-            <w:shd w:val="clear" w:color="auto" w:fill="F2F2F2" w:themeFill="background1" w:themeFillShade="F2"/>
-          </w:tcPr>
-          <w:p>
-            <w:pPr>
-              <w:jc w:val="center"/>
-            </w:pPr>
+            <w:tcW w:type="dxa" w:w="637"/>
+          </w:tcPr>
+          <w:p>
             <w:r>
               <w:t>15</w:t>
             </w:r>
@@ -13086,7 +13095,7 @@
         </w:tc>
         <w:tc>
           <w:tcPr>
-            <w:tcW w:w="2173" w:type="dxa"/>
+            <w:tcW w:type="dxa" w:w="2173"/>
           </w:tcPr>
           <w:p>
             <w:r>
@@ -13096,7 +13105,7 @@
         </w:tc>
         <w:tc>
           <w:tcPr>
-            <w:tcW w:w="6216" w:type="dxa"/>
+            <w:tcW w:type="dxa" w:w="6216"/>
           </w:tcPr>
           <w:p>
             <w:r>
@@ -13108,13 +13117,9 @@
       <w:tr>
         <w:tc>
           <w:tcPr>
-            <w:tcW w:w="637" w:type="dxa"/>
-            <w:shd w:val="clear" w:color="auto" w:fill="F2F2F2" w:themeFill="background1" w:themeFillShade="F2"/>
-          </w:tcPr>
-          <w:p>
-            <w:pPr>
-              <w:jc w:val="center"/>
-            </w:pPr>
+            <w:tcW w:type="dxa" w:w="637"/>
+          </w:tcPr>
+          <w:p>
             <w:r>
               <w:t>16</w:t>
             </w:r>
@@ -13122,7 +13127,7 @@
         </w:tc>
         <w:tc>
           <w:tcPr>
-            <w:tcW w:w="2173" w:type="dxa"/>
+            <w:tcW w:type="dxa" w:w="2173"/>
           </w:tcPr>
           <w:p>
             <w:r>
@@ -13132,7 +13137,7 @@
         </w:tc>
         <w:tc>
           <w:tcPr>
-            <w:tcW w:w="6216" w:type="dxa"/>
+            <w:tcW w:type="dxa" w:w="6216"/>
           </w:tcPr>
           <w:p>
             <w:r>
@@ -13144,13 +13149,9 @@
       <w:tr>
         <w:tc>
           <w:tcPr>
-            <w:tcW w:w="637" w:type="dxa"/>
-            <w:shd w:val="clear" w:color="auto" w:fill="F2F2F2" w:themeFill="background1" w:themeFillShade="F2"/>
-          </w:tcPr>
-          <w:p>
-            <w:pPr>
-              <w:jc w:val="center"/>
-            </w:pPr>
+            <w:tcW w:type="dxa" w:w="637"/>
+          </w:tcPr>
+          <w:p>
             <w:r>
               <w:t>17</w:t>
             </w:r>
@@ -13158,7 +13159,7 @@
         </w:tc>
         <w:tc>
           <w:tcPr>
-            <w:tcW w:w="2173" w:type="dxa"/>
+            <w:tcW w:type="dxa" w:w="2173"/>
           </w:tcPr>
           <w:p>
             <w:r>
@@ -13168,7 +13169,7 @@
         </w:tc>
         <w:tc>
           <w:tcPr>
-            <w:tcW w:w="6216" w:type="dxa"/>
+            <w:tcW w:type="dxa" w:w="6216"/>
           </w:tcPr>
           <w:p>
             <w:r>
@@ -13400,44 +13401,41 @@
       <w:tr>
         <w:tc>
           <w:tcPr>
-            <w:tcW w:w="2351" w:type="dxa"/>
-          </w:tcPr>
-          <w:p>
-            <w:r>
-              <w:t>Violation record lookup by name localized</w:t>
-            </w:r>
-          </w:p>
-        </w:tc>
-        <w:tc>
-          <w:tcPr>
-            <w:tcW w:w="2945" w:type="dxa"/>
-          </w:tcPr>
-          <w:p>
-            <w:r>
-              <w:t>violationRecord() supports lookup by name, but diacritic characters in Vietnamese names may cause mismatches.</w:t>
-            </w:r>
-          </w:p>
-        </w:tc>
-        <w:tc>
-          <w:tcPr>
-            <w:tcW w:w="975" w:type="dxa"/>
-          </w:tcPr>
-          <w:p>
-            <w:pPr>
-              <w:jc w:val="center"/>
-            </w:pPr>
-            <w:r>
-              <w:t>Low</w:t>
-            </w:r>
-          </w:p>
-        </w:tc>
-        <w:tc>
-          <w:tcPr>
-            <w:tcW w:w="2755" w:type="dxa"/>
-          </w:tcPr>
-          <w:p>
-            <w:r>
-              <w:t>Consider adding diacritic-normalization or fuzzy matching.</w:t>
+            <w:tcW w:type="dxa" w:w="2351"/>
+          </w:tcPr>
+          <w:p>
+            <w:r>
+              <w:t>Invalid calendar dates may be accepted</w:t>
+            </w:r>
+          </w:p>
+        </w:tc>
+        <w:tc>
+          <w:tcPr>
+            <w:tcW w:type="dxa" w:w="2945"/>
+          </w:tcPr>
+          <w:p>
+            <w:r>
+              <w:t>parseDate() uses mktime() after sscanf(), which silently normalizes invalid dates (e.g., 31/02/2026 becomes 03/03/2026). Users may not realize the date was adjusted.</w:t>
+            </w:r>
+          </w:p>
+        </w:tc>
+        <w:tc>
+          <w:tcPr>
+            <w:tcW w:type="dxa" w:w="975"/>
+          </w:tcPr>
+          <w:p>
+            <w:r>
+              <w:t>High</w:t>
+            </w:r>
+          </w:p>
+        </w:tc>
+        <w:tc>
+          <w:tcPr>
+            <w:tcW w:type="dxa" w:w="2755"/>
+          </w:tcPr>
+          <w:p>
+            <w:r>
+              <w:t>Validate day/month/year combinations before calling mktime().</w:t>
             </w:r>
           </w:p>
         </w:tc>
@@ -13445,32 +13443,29 @@
       <w:tr>
         <w:tc>
           <w:tcPr>
-            <w:tcW w:w="2351" w:type="dxa"/>
-          </w:tcPr>
-          <w:p>
-            <w:r>
-              <w:t>ADMIN legacy account has no Member record</w:t>
-            </w:r>
-          </w:p>
-        </w:tc>
-        <w:tc>
-          <w:tcPr>
-            <w:tcW w:w="2945" w:type="dxa"/>
-          </w:tcPr>
-          <w:p>
-            <w:r>
-              <w:t>The auto-created ADMIN/ADMIN account from first-run bootstrap has no corresponding Member entry. Accessing profile view from this account fails.</w:t>
-            </w:r>
-          </w:p>
-        </w:tc>
-        <w:tc>
-          <w:tcPr>
-            <w:tcW w:w="975" w:type="dxa"/>
-          </w:tcPr>
-          <w:p>
-            <w:pPr>
-              <w:jc w:val="center"/>
-            </w:pPr>
+            <w:tcW w:type="dxa" w:w="2351"/>
+          </w:tcPr>
+          <w:p>
+            <w:r>
+              <w:t>Violation record lookup by name localized</w:t>
+            </w:r>
+          </w:p>
+        </w:tc>
+        <w:tc>
+          <w:tcPr>
+            <w:tcW w:type="dxa" w:w="2945"/>
+          </w:tcPr>
+          <w:p>
+            <w:r>
+              <w:t>violationRecord() supports lookup by name, but diacritic characters in Vietnamese names may cause mismatches.</w:t>
+            </w:r>
+          </w:p>
+        </w:tc>
+        <w:tc>
+          <w:tcPr>
+            <w:tcW w:type="dxa" w:w="975"/>
+          </w:tcPr>
+          <w:p>
             <w:r>
               <w:t>Low</w:t>
             </w:r>
@@ -13478,11 +13473,11 @@
         </w:tc>
         <w:tc>
           <w:tcPr>
-            <w:tcW w:w="2755" w:type="dxa"/>
-          </w:tcPr>
-          <w:p>
-            <w:r>
-              <w:t>Use SE203055 (Phuc@2006) for BCN access; ADMIN account kept for backward compatibility only.</w:t>
+            <w:tcW w:type="dxa" w:w="2755"/>
+          </w:tcPr>
+          <w:p>
+            <w:r>
+              <w:t>Consider adding diacritic-normalization or fuzzy matching.</w:t>
             </w:r>
           </w:p>
         </w:tc>
@@ -13490,7 +13485,49 @@
       <w:tr>
         <w:tc>
           <w:tcPr>
-            <w:tcW w:w="2351" w:type="dxa"/>
+            <w:tcW w:type="dxa" w:w="2351"/>
+          </w:tcPr>
+          <w:p>
+            <w:r>
+              <w:t>ADMIN legacy account has no Member record</w:t>
+            </w:r>
+          </w:p>
+        </w:tc>
+        <w:tc>
+          <w:tcPr>
+            <w:tcW w:type="dxa" w:w="2945"/>
+          </w:tcPr>
+          <w:p>
+            <w:r>
+              <w:t>The auto-created ADMIN/ADMIN account from first-run bootstrap has no corresponding Member entry. Accessing profile view from this account fails.</w:t>
+            </w:r>
+          </w:p>
+        </w:tc>
+        <w:tc>
+          <w:tcPr>
+            <w:tcW w:type="dxa" w:w="975"/>
+          </w:tcPr>
+          <w:p>
+            <w:r>
+              <w:t>Low</w:t>
+            </w:r>
+          </w:p>
+        </w:tc>
+        <w:tc>
+          <w:tcPr>
+            <w:tcW w:type="dxa" w:w="2755"/>
+          </w:tcPr>
+          <w:p>
+            <w:r>
+              <w:t>Use SE203055 (Phuc@2006) for BCN access; ADMIN account kept for backward compatibility only.</w:t>
+            </w:r>
+          </w:p>
+        </w:tc>
+      </w:tr>
+      <w:tr>
+        <w:tc>
+          <w:tcPr>
+            <w:tcW w:type="dxa" w:w="2351"/>
           </w:tcPr>
           <w:p>
             <w:r>
@@ -13500,7 +13537,7 @@
         </w:tc>
         <w:tc>
           <w:tcPr>
-            <w:tcW w:w="2945" w:type="dxa"/>
+            <w:tcW w:type="dxa" w:w="2945"/>
           </w:tcPr>
           <w:p>
             <w:r>
@@ -13510,12 +13547,9 @@
         </w:tc>
         <w:tc>
           <w:tcPr>
-            <w:tcW w:w="975" w:type="dxa"/>
-          </w:tcPr>
-          <w:p>
-            <w:pPr>
-              <w:jc w:val="center"/>
-            </w:pPr>
+            <w:tcW w:type="dxa" w:w="975"/>
+          </w:tcPr>
+          <w:p>
             <w:r>
               <w:t>Low</w:t>
             </w:r>
@@ -13523,7 +13557,7 @@
         </w:tc>
         <w:tc>
           <w:tcPr>
-            <w:tcW w:w="2755" w:type="dxa"/>
+            <w:tcW w:type="dxa" w:w="2755"/>
           </w:tcPr>
           <w:p>
             <w:r>

</xml_diff>